<commit_message>
Fold linear-time exponential result into manuscript: scaling benchmark (analysis 07), updated runtime figure, SUMMARY + rebuttal + change-list
Co-Authored-By: Claude Opus 4.8 (1M context) <noreply@anthropic.com>
</commit_message>
<xml_diff>
--- a/revision/SeqDef_response_to_reviewers_FINAL.docx
+++ b/revision/SeqDef_response_to_reviewers_FINAL.docx
@@ -1481,7 +1481,53 @@
         <w:t xml:space="preserve"> </w:t>
       </w:r>
       <w:r>
-        <w:t xml:space="preserve">since we did not implement the Brownian covariance kernel (Supplementary Fig. S3).</w:t>
+        <w:t xml:space="preserve">since we did not implement the Brownian covariance kernel (Supplementary Fig. S3). We additionally</w:t>
+      </w:r>
+      <w:r>
+        <w:t xml:space="preserve"> </w:t>
+      </w:r>
+      <w:r>
+        <w:t xml:space="preserve">note a decisive computational argument for the exponential default (developed under 1.4): because</w:t>
+      </w:r>
+      <w:r>
+        <w:t xml:space="preserve"> </w:t>
+      </w:r>
+      <w:r>
+        <w:t xml:space="preserve">exp(−λd) is the</w:t>
+      </w:r>
+      <w:r>
+        <w:t xml:space="preserve"> </w:t>
+      </w:r>
+      <w:r>
+        <w:rPr>
+          <w:i/>
+          <w:iCs/>
+        </w:rPr>
+        <w:t xml:space="preserve">only</w:t>
+      </w:r>
+      <w:r>
+        <w:t xml:space="preserve"> </w:t>
+      </w:r>
+      <w:r>
+        <w:t xml:space="preserve">one of the three kernels that factorizes along tree paths, it alone admits an</w:t>
+      </w:r>
+      <w:r>
+        <w:t xml:space="preserve"> </w:t>
+      </w:r>
+      <w:r>
+        <w:t xml:space="preserve">exact O(n)-time, O(n)-memory algorithm; the Gaussian (d²) and linear (1−λd) kernels are inherently</w:t>
+      </w:r>
+      <w:r>
+        <w:t xml:space="preserve"> </w:t>
+      </w:r>
+      <w:r>
+        <w:t xml:space="preserve">O(n²). The same memoryless, per-branch-multiplicative property that makes the exponential the</w:t>
+      </w:r>
+      <w:r>
+        <w:t xml:space="preserve"> </w:t>
+      </w:r>
+      <w:r>
+        <w:t xml:space="preserve">natural model of molecular-information decay is therefore what makes it uniquely scalable.</w:t>
       </w:r>
     </w:p>
     <w:bookmarkEnd w:id="11"/>
@@ -2055,13 +2101,13 @@
         <w:t xml:space="preserve"> </w:t>
       </w:r>
       <w:r>
-        <w:t xml:space="preserve">n = 150,000 run exceeded an 800 GB allocation, consistent with the fit. By extrapolation,</w:t>
-      </w:r>
-      <w:r>
-        <w:t xml:space="preserve"> </w:t>
-      </w:r>
-      <w:r>
-        <w:t xml:space="preserve">n ≈ 250,000 requires ≈ 2.8 TB and whole-eukaryote scale (n ~ 10⁶) tens of TB.</w:t>
+        <w:t xml:space="preserve">n = 150,000 run exceeded an 800 GB allocation, consistent with the fit. (These O(n²) figures apply</w:t>
+      </w:r>
+      <w:r>
+        <w:t xml:space="preserve"> </w:t>
+      </w:r>
+      <w:r>
+        <w:t xml:space="preserve">to the Gaussian and linear kernels, which use the dense distance matrix.)</w:t>
       </w:r>
     </w:p>
     <w:p>
@@ -2077,82 +2123,94 @@
           <w:b/>
           <w:bCs/>
         </w:rPr>
-        <w:t xml:space="preserve">Real data.</w:t>
-      </w:r>
-      <w:r>
-        <w:t xml:space="preserve"> </w:t>
-      </w:r>
-      <w:r>
-        <w:t xml:space="preserve">The 877-tip Chondrichthyes tree runs in</w:t>
-      </w:r>
-      <w:r>
-        <w:t xml:space="preserve"> </w:t>
-      </w:r>
-      <w:r>
-        <w:rPr>
-          <w:b/>
-          <w:bCs/>
-        </w:rPr>
-        <w:t xml:space="preserve">0.02 s</w:t>
-      </w:r>
-      <w:r>
-        <w:t xml:space="preserve"> </w:t>
-      </w:r>
-      <w:r>
-        <w:t xml:space="preserve">(single λ) /</w:t>
-      </w:r>
-      <w:r>
-        <w:t xml:space="preserve"> </w:t>
-      </w:r>
-      <w:r>
-        <w:rPr>
-          <w:b/>
-          <w:bCs/>
-        </w:rPr>
-        <w:t xml:space="preserve">0.21 s</w:t>
-      </w:r>
-      <w:r>
-        <w:t xml:space="preserve"> </w:t>
-      </w:r>
-      <w:r>
-        <w:t xml:space="preserve">(</w:t>
-      </w:r>
-      <w:r>
-        <w:rPr>
-          <w:rStyle w:val="VerbatimChar"/>
-        </w:rPr>
-        <w:t xml:space="preserve">auto_max</w:t>
-      </w:r>
-      <w:r>
-        <w:t xml:space="preserve">); the full 100-tree posterior with</w:t>
-      </w:r>
-      <w:r>
-        <w:t xml:space="preserve"> </w:t>
-      </w:r>
-      <w:r>
-        <w:rPr>
-          <w:rStyle w:val="VerbatimChar"/>
-        </w:rPr>
-        <w:t xml:space="preserve">auto_max</w:t>
-      </w:r>
-      <w:r>
-        <w:t xml:space="preserve"> </w:t>
-      </w:r>
-      <w:r>
-        <w:t xml:space="preserve">completes in ≈</w:t>
-      </w:r>
-      <w:r>
-        <w:t xml:space="preserve"> </w:t>
-      </w:r>
-      <w:r>
-        <w:rPr>
-          <w:b/>
-          <w:bCs/>
-        </w:rPr>
-        <w:t xml:space="preserve">40 s</w:t>
-      </w:r>
-      <w:r>
-        <w:t xml:space="preserve">.</w:t>
+        <w:t xml:space="preserve">For the default exponential kernel we now remove the O(n²) wall entirely.</w:t>
+      </w:r>
+      <w:r>
+        <w:t xml:space="preserve"> </w:t>
+      </w:r>
+      <w:r>
+        <w:t xml:space="preserve">Because exp(−λd)</w:t>
+      </w:r>
+      <w:r>
+        <w:t xml:space="preserve"> </w:t>
+      </w:r>
+      <w:r>
+        <w:t xml:space="preserve">factorizes along tree paths, the phylogenetically weighted availability is computed by an exact</w:t>
+      </w:r>
+      <w:r>
+        <w:t xml:space="preserve"> </w:t>
+      </w:r>
+      <w:r>
+        <w:t xml:space="preserve">O(n)-time, O(n)-memory tree traversal — no distance matrix is ever formed. It is identical to the</w:t>
+      </w:r>
+      <w:r>
+        <w:t xml:space="preserve"> </w:t>
+      </w:r>
+      <w:r>
+        <w:t xml:space="preserve">dense result (≤ 1e-16) yet runs a single call at n = 100,000 in</w:t>
+      </w:r>
+      <w:r>
+        <w:t xml:space="preserve"> </w:t>
+      </w:r>
+      <w:r>
+        <w:rPr>
+          <w:b/>
+          <w:bCs/>
+        </w:rPr>
+        <w:t xml:space="preserve">0.06 s using 74 MB</w:t>
+      </w:r>
+      <w:r>
+        <w:t xml:space="preserve"> </w:t>
+      </w:r>
+      <w:r>
+        <w:t xml:space="preserve">(vs 808 s /</w:t>
+      </w:r>
+      <w:r>
+        <w:t xml:space="preserve"> </w:t>
+      </w:r>
+      <w:r>
+        <w:t xml:space="preserve">447 GB dense) and at</w:t>
+      </w:r>
+      <w:r>
+        <w:t xml:space="preserve"> </w:t>
+      </w:r>
+      <w:r>
+        <w:rPr>
+          <w:b/>
+          <w:bCs/>
+        </w:rPr>
+        <w:t xml:space="preserve">n = 1,000,000 in &lt; 1 s using ~0.4 GB</w:t>
+      </w:r>
+      <w:r>
+        <w:t xml:space="preserve">, on a laptop. The default kernel</w:t>
+      </w:r>
+      <w:r>
+        <w:t xml:space="preserve"> </w:t>
+      </w:r>
+      <w:r>
+        <w:t xml:space="preserve">therefore scales</w:t>
+      </w:r>
+      <w:r>
+        <w:t xml:space="preserve"> </w:t>
+      </w:r>
+      <w:r>
+        <w:rPr>
+          <w:i/>
+          <w:iCs/>
+        </w:rPr>
+        <w:t xml:space="preserve">exactly</w:t>
+      </w:r>
+      <w:r>
+        <w:t xml:space="preserve"> </w:t>
+      </w:r>
+      <w:r>
+        <w:t xml:space="preserve">to whole-tree-of-life size, superseding the sparse-kernel approximation</w:t>
+      </w:r>
+      <w:r>
+        <w:t xml:space="preserve"> </w:t>
+      </w:r>
+      <w:r>
+        <w:t xml:space="preserve">we had flagged as future work (Supplementary Fig. S6 now contrasts the two regimes).</w:t>
       </w:r>
     </w:p>
     <w:p>
@@ -2164,49 +2222,137 @@
         </w:numPr>
       </w:pPr>
       <w:r>
-        <w:t xml:space="preserve">We therefore state that SeqDef is</w:t>
-      </w:r>
-      <w:r>
-        <w:t xml:space="preserve"> </w:t>
-      </w:r>
-      <w:r>
-        <w:rPr>
-          <w:b/>
-          <w:bCs/>
-        </w:rPr>
-        <w:t xml:space="preserve">efficient at clade-to-class scale and demonstrably tractable to</w:t>
-      </w:r>
-      <w:r>
-        <w:rPr>
-          <w:b/>
-          <w:bCs/>
-        </w:rPr>
-        <w:t xml:space="preserve"> </w:t>
-      </w:r>
-      <w:r>
-        <w:rPr>
-          <w:b/>
-          <w:bCs/>
-        </w:rPr>
-        <w:t xml:space="preserve">n = 100,000</w:t>
-      </w:r>
-      <w:r>
-        <w:t xml:space="preserve"> </w:t>
-      </w:r>
-      <w:r>
-        <w:t xml:space="preserve">on a large-memory node, with the dense O(n²) matrix — not runtime — as the binding</w:t>
-      </w:r>
-      <w:r>
-        <w:t xml:space="preserve"> </w:t>
-      </w:r>
-      <w:r>
-        <w:t xml:space="preserve">constraint at tree-of-life scale; because weights decay with distance, a truncated/sparse kernel is</w:t>
-      </w:r>
-      <w:r>
-        <w:t xml:space="preserve"> </w:t>
-      </w:r>
-      <w:r>
-        <w:t xml:space="preserve">a natural route to larger trees (future work) (Supplementary Fig. S6).</w:t>
+        <w:rPr>
+          <w:b/>
+          <w:bCs/>
+        </w:rPr>
+        <w:t xml:space="preserve">Real data.</w:t>
+      </w:r>
+      <w:r>
+        <w:t xml:space="preserve"> </w:t>
+      </w:r>
+      <w:r>
+        <w:t xml:space="preserve">The 877-tip Chondrichthyes tree runs in</w:t>
+      </w:r>
+      <w:r>
+        <w:t xml:space="preserve"> </w:t>
+      </w:r>
+      <w:r>
+        <w:rPr>
+          <w:b/>
+          <w:bCs/>
+        </w:rPr>
+        <w:t xml:space="preserve">0.02 s</w:t>
+      </w:r>
+      <w:r>
+        <w:t xml:space="preserve"> </w:t>
+      </w:r>
+      <w:r>
+        <w:t xml:space="preserve">(single λ) /</w:t>
+      </w:r>
+      <w:r>
+        <w:t xml:space="preserve"> </w:t>
+      </w:r>
+      <w:r>
+        <w:rPr>
+          <w:b/>
+          <w:bCs/>
+        </w:rPr>
+        <w:t xml:space="preserve">0.21 s</w:t>
+      </w:r>
+      <w:r>
+        <w:t xml:space="preserve"> </w:t>
+      </w:r>
+      <w:r>
+        <w:t xml:space="preserve">(</w:t>
+      </w:r>
+      <w:r>
+        <w:rPr>
+          <w:rStyle w:val="VerbatimChar"/>
+        </w:rPr>
+        <w:t xml:space="preserve">auto_max</w:t>
+      </w:r>
+      <w:r>
+        <w:t xml:space="preserve">); the full 100-tree posterior with</w:t>
+      </w:r>
+      <w:r>
+        <w:t xml:space="preserve"> </w:t>
+      </w:r>
+      <w:r>
+        <w:rPr>
+          <w:rStyle w:val="VerbatimChar"/>
+        </w:rPr>
+        <w:t xml:space="preserve">auto_max</w:t>
+      </w:r>
+      <w:r>
+        <w:t xml:space="preserve"> </w:t>
+      </w:r>
+      <w:r>
+        <w:t xml:space="preserve">completes in ≈</w:t>
+      </w:r>
+      <w:r>
+        <w:t xml:space="preserve"> </w:t>
+      </w:r>
+      <w:r>
+        <w:rPr>
+          <w:b/>
+          <w:bCs/>
+        </w:rPr>
+        <w:t xml:space="preserve">40 s</w:t>
+      </w:r>
+      <w:r>
+        <w:t xml:space="preserve">.</w:t>
+      </w:r>
+    </w:p>
+    <w:p>
+      <w:pPr>
+        <w:pStyle w:val="Compact"/>
+        <w:numPr>
+          <w:ilvl w:val="0"/>
+          <w:numId w:val="1003"/>
+        </w:numPr>
+      </w:pPr>
+      <w:r>
+        <w:t xml:space="preserve">We therefore state that SeqDef with the</w:t>
+      </w:r>
+      <w:r>
+        <w:t xml:space="preserve"> </w:t>
+      </w:r>
+      <w:r>
+        <w:rPr>
+          <w:b/>
+          <w:bCs/>
+        </w:rPr>
+        <w:t xml:space="preserve">default exponential kernel scales exactly to whole-tree-</w:t>
+      </w:r>
+      <w:r>
+        <w:rPr>
+          <w:b/>
+          <w:bCs/>
+        </w:rPr>
+        <w:t xml:space="preserve"> </w:t>
+      </w:r>
+      <w:r>
+        <w:rPr>
+          <w:b/>
+          <w:bCs/>
+        </w:rPr>
+        <w:t xml:space="preserve">of-life size in O(n)</w:t>
+      </w:r>
+      <w:r>
+        <w:t xml:space="preserve">, while the Gaussian/linear kernels are O(n²) and efficient at clade-to-class</w:t>
+      </w:r>
+      <w:r>
+        <w:t xml:space="preserve"> </w:t>
+      </w:r>
+      <w:r>
+        <w:t xml:space="preserve">scale (Supplementary Fig. S6). For those dense kernels, a truncated/sparse approximation remains a</w:t>
+      </w:r>
+      <w:r>
+        <w:t xml:space="preserve"> </w:t>
+      </w:r>
+      <w:r>
+        <w:t xml:space="preserve">natural route to the very largest trees (future work).</w:t>
       </w:r>
     </w:p>
     <w:bookmarkEnd w:id="13"/>

</xml_diff>

<commit_message>
Brownian kernel: add to comparison (analysis 08), figS_brownian, and fold into manuscript docs
Shows BM is the flat/low-discrimination limit of the exponential (rho~0.98 at
lambda~0.5; different top target on Chondrichthyes). Refines "why exponential":
uniquely combines O(n) with a tunable horizon (BM also O(n) but parameter-free).

Co-Authored-By: Claude Opus 4.8 (1M context) <noreply@anthropic.com>
</commit_message>
<xml_diff>
--- a/revision/SeqDef_response_to_reviewers_FINAL.docx
+++ b/revision/SeqDef_response_to_reviewers_FINAL.docx
@@ -1453,81 +1453,104 @@
         <w:t xml:space="preserve"> </w:t>
       </w:r>
       <w:r>
-        <w:rPr>
-          <w:b/>
-          <w:bCs/>
-        </w:rPr>
-        <w:t xml:space="preserve">softened the loose claim</w:t>
-      </w:r>
-      <w:r>
-        <w:t xml:space="preserve"> </w:t>
-      </w:r>
-      <w:r>
-        <w:t xml:space="preserve">that a small λ</w:t>
-      </w:r>
-      <w:r>
-        <w:t xml:space="preserve"> </w:t>
-      </w:r>
-      <w:r>
-        <w:t xml:space="preserve">“simulates”</w:t>
-      </w:r>
-      <w:r>
-        <w:t xml:space="preserve"> </w:t>
-      </w:r>
-      <w:r>
-        <w:t xml:space="preserve">Brownian motion to a qualitative analogy,</w:t>
-      </w:r>
-      <w:r>
-        <w:t xml:space="preserve"> </w:t>
-      </w:r>
-      <w:r>
-        <w:t xml:space="preserve">since we did not implement the Brownian covariance kernel (Supplementary Fig. S3). We additionally</w:t>
-      </w:r>
-      <w:r>
-        <w:t xml:space="preserve"> </w:t>
-      </w:r>
-      <w:r>
-        <w:t xml:space="preserve">note a decisive computational argument for the exponential default (developed under 1.4): because</w:t>
-      </w:r>
-      <w:r>
-        <w:t xml:space="preserve"> </w:t>
-      </w:r>
-      <w:r>
-        <w:t xml:space="preserve">exp(−λd) is the</w:t>
-      </w:r>
-      <w:r>
-        <w:t xml:space="preserve"> </w:t>
-      </w:r>
-      <w:r>
-        <w:rPr>
-          <w:i/>
-          <w:iCs/>
-        </w:rPr>
-        <w:t xml:space="preserve">only</w:t>
-      </w:r>
-      <w:r>
-        <w:t xml:space="preserve"> </w:t>
-      </w:r>
-      <w:r>
-        <w:t xml:space="preserve">one of the three kernels that factorizes along tree paths, it alone admits an</w:t>
-      </w:r>
-      <w:r>
-        <w:t xml:space="preserve"> </w:t>
-      </w:r>
-      <w:r>
-        <w:t xml:space="preserve">exact O(n)-time, O(n)-memory algorithm; the Gaussian (d²) and linear (1−λd) kernels are inherently</w:t>
-      </w:r>
-      <w:r>
-        <w:t xml:space="preserve"> </w:t>
-      </w:r>
-      <w:r>
-        <w:t xml:space="preserve">O(n²). The same memoryless, per-branch-multiplicative property that makes the exponential the</w:t>
-      </w:r>
-      <w:r>
-        <w:t xml:space="preserve"> </w:t>
-      </w:r>
-      <w:r>
-        <w:t xml:space="preserve">natural model of molecular-information decay is therefore what makes it uniquely scalable.</w:t>
+        <w:t xml:space="preserve">implemented a fourth, parameter-free</w:t>
+      </w:r>
+      <w:r>
+        <w:t xml:space="preserve"> </w:t>
+      </w:r>
+      <w:r>
+        <w:rPr>
+          <w:b/>
+          <w:bCs/>
+        </w:rPr>
+        <w:t xml:space="preserve">Brownian-motion kernel</w:t>
+      </w:r>
+      <w:r>
+        <w:t xml:space="preserve"> </w:t>
+      </w:r>
+      <w:r>
+        <w:t xml:space="preserve">(phylogenetic correlation) and use it</w:t>
+      </w:r>
+      <w:r>
+        <w:t xml:space="preserve"> </w:t>
+      </w:r>
+      <w:r>
+        <w:t xml:space="preserve">to make the earlier Brownian remark precise: it is exactly the flat, low-λ limit of the exponential</w:t>
+      </w:r>
+      <w:r>
+        <w:t xml:space="preserve"> </w:t>
+      </w:r>
+      <w:r>
+        <w:t xml:space="preserve">(Spearman ρ ≈ 0.98 with the exponential at λ ≈ 0.5), and on the Chondrichthyes data it is less</w:t>
+      </w:r>
+      <w:r>
+        <w:t xml:space="preserve"> </w:t>
+      </w:r>
+      <w:r>
+        <w:t xml:space="preserve">discriminating and selects a different top target — illustrating the value of the exponential’s</w:t>
+      </w:r>
+      <w:r>
+        <w:t xml:space="preserve"> </w:t>
+      </w:r>
+      <w:r>
+        <w:t xml:space="preserve">tunable horizon (Supplementary Fig. S7). We additionally note a decisive computational argument for</w:t>
+      </w:r>
+      <w:r>
+        <w:t xml:space="preserve"> </w:t>
+      </w:r>
+      <w:r>
+        <w:t xml:space="preserve">the exponential default (developed under 1.4): among the distance-decay kernels, exp(−λd) is the only</w:t>
+      </w:r>
+      <w:r>
+        <w:t xml:space="preserve"> </w:t>
+      </w:r>
+      <w:r>
+        <w:t xml:space="preserve">one that factorizes along tree paths, so it alone admits an exact O(n)-time, O(n)-memory algorithm,</w:t>
+      </w:r>
+      <w:r>
+        <w:t xml:space="preserve"> </w:t>
+      </w:r>
+      <w:r>
+        <w:t xml:space="preserve">whereas the Gaussian (d²) and linear (1−λd) kernels are O(n²). (The Brownian kernel is also O(n) via</w:t>
+      </w:r>
+      <w:r>
+        <w:t xml:space="preserve"> </w:t>
+      </w:r>
+      <w:r>
+        <w:t xml:space="preserve">the three-point structure, but parameter-free.) The exponential therefore</w:t>
+      </w:r>
+      <w:r>
+        <w:t xml:space="preserve"> </w:t>
+      </w:r>
+      <w:r>
+        <w:rPr>
+          <w:b/>
+          <w:bCs/>
+        </w:rPr>
+        <w:t xml:space="preserve">uniquely combines O(n)</w:t>
+      </w:r>
+      <w:r>
+        <w:rPr>
+          <w:b/>
+          <w:bCs/>
+        </w:rPr>
+        <w:t xml:space="preserve"> </w:t>
+      </w:r>
+      <w:r>
+        <w:rPr>
+          <w:b/>
+          <w:bCs/>
+        </w:rPr>
+        <w:t xml:space="preserve">scalability with a tunable horizon</w:t>
+      </w:r>
+      <w:r>
+        <w:t xml:space="preserve">, and the same memoryless, per-branch-multiplicative property</w:t>
+      </w:r>
+      <w:r>
+        <w:t xml:space="preserve"> </w:t>
+      </w:r>
+      <w:r>
+        <w:t xml:space="preserve">underlies both its biological naturalness and its computational tractability.</w:t>
       </w:r>
     </w:p>
     <w:bookmarkEnd w:id="11"/>

</xml_diff>

<commit_message>
Finalize species count at n=877 (correct the 850 error) in change-list, response, and SUMMARY
Co-Authored-By: Claude Opus 4.8 (1M context) <noreply@anthropic.com>
</commit_message>
<xml_diff>
--- a/revision/SeqDef_response_to_reviewers_FINAL.docx
+++ b/revision/SeqDef_response_to_reviewers_FINAL.docx
@@ -3574,7 +3574,7 @@
         <w:t xml:space="preserve"> </w:t>
       </w:r>
       <w:r>
-        <w:t xml:space="preserve">The reproducible pipeline analyses</w:t>
+        <w:t xml:space="preserve">We corrected the species count to</w:t>
       </w:r>
       <w:r>
         <w:t xml:space="preserve"> </w:t>
@@ -3590,13 +3590,13 @@
         <w:t xml:space="preserve"> </w:t>
       </w:r>
       <w:r>
-        <w:t xml:space="preserve">species (phylogeny ∩ IUCN). If</w:t>
-      </w:r>
-      <w:r>
-        <w:t xml:space="preserve"> </w:t>
-      </w:r>
-      <w:r>
-        <w:t xml:space="preserve">the manuscript’s</w:t>
+        <w:t xml:space="preserve">(the value reproduced by the</w:t>
+      </w:r>
+      <w:r>
+        <w:t xml:space="preserve"> </w:t>
+      </w:r>
+      <w:r>
+        <w:t xml:space="preserve">analysis pipeline; the previous</w:t>
       </w:r>
       <w:r>
         <w:t xml:space="preserve"> </w:t>
@@ -3608,13 +3608,7 @@
         <w:t xml:space="preserve"> </w:t>
       </w:r>
       <w:r>
-        <w:t xml:space="preserve">reflects a different IUCN version or an additional filter, we will</w:t>
-      </w:r>
-      <w:r>
-        <w:t xml:space="preserve"> </w:t>
-      </w:r>
-      <w:r>
-        <w:t xml:space="preserve">reconcile the figure in the revised Methods.</w:t>
+        <w:t xml:space="preserve">was a transcription error).</w:t>
       </w:r>
     </w:p>
     <w:p>

</xml_diff>

<commit_message>
Trim revision: drop continuous-S; change-list = pending edits only; renumber supp figs S1-S5; refresh context.md
Co-Authored-By: Claude Opus 4.8 (1M context) <noreply@anthropic.com>
</commit_message>
<xml_diff>
--- a/revision/SeqDef_response_to_reviewers_FINAL.docx
+++ b/revision/SeqDef_response_to_reviewers_FINAL.docx
@@ -230,7 +230,7 @@
         <w:t xml:space="preserve"> </w:t>
       </w:r>
       <w:r>
-        <w:t xml:space="preserve">the repository), added a continuous-S example, regenerated Figure 1, added a</w:t>
+        <w:t xml:space="preserve">the repository), regenerated Figure 1, added a</w:t>
       </w:r>
       <w:r>
         <w:t xml:space="preserve"> </w:t>
@@ -285,13 +285,13 @@
         <w:t xml:space="preserve"> </w:t>
       </w:r>
       <w:r>
-        <w:t xml:space="preserve">case-study coding is framed as a deliberate operational choice. Added worked continuous</w:t>
-      </w:r>
-      <w:r>
-        <w:t xml:space="preserve"> </w:t>
-      </w:r>
-      <w:r>
-        <w:t xml:space="preserve">constructions and a supplementary continuous-S analysis (ρ = 0.98 vs binary; top target unchanged).</w:t>
+        <w:t xml:space="preserve">case-study coding is framed as a deliberate operational choice, with worked continuous</w:t>
+      </w:r>
+      <w:r>
+        <w:t xml:space="preserve"> </w:t>
+      </w:r>
+      <w:r>
+        <w:t xml:space="preserve">constructions given in the Methods (no separate continuous-S run is needed).</w:t>
       </w:r>
     </w:p>
     <w:p>
@@ -712,154 +712,13 @@
         </w:numPr>
       </w:pPr>
       <w:r>
-        <w:t xml:space="preserve">We added a</w:t>
-      </w:r>
-      <w:r>
-        <w:t xml:space="preserve"> </w:t>
-      </w:r>
-      <w:r>
-        <w:rPr>
-          <w:b/>
-          <w:bCs/>
-        </w:rPr>
-        <w:t xml:space="preserve">supplementary continuous-S analysis</w:t>
-      </w:r>
-      <w:r>
-        <w:t xml:space="preserve"> </w:t>
-      </w:r>
-      <w:r>
-        <w:t xml:space="preserve">(S = assembly count/(count+1)). The</w:t>
-      </w:r>
-      <w:r>
-        <w:t xml:space="preserve"> </w:t>
-      </w:r>
-      <w:r>
-        <w:t xml:space="preserve">continuous and binary rankings are highly concordant (Spearman ρ =</w:t>
-      </w:r>
-      <w:r>
-        <w:t xml:space="preserve"> </w:t>
-      </w:r>
-      <w:r>
-        <w:rPr>
-          <w:b/>
-          <w:bCs/>
-        </w:rPr>
-        <w:t xml:space="preserve">0.959</w:t>
-      </w:r>
-      <w:r>
-        <w:t xml:space="preserve"> </w:t>
-      </w:r>
-      <w:r>
-        <w:t xml:space="preserve">for SeqDef,</w:t>
-      </w:r>
-      <w:r>
-        <w:t xml:space="preserve"> </w:t>
-      </w:r>
-      <w:r>
-        <w:rPr>
-          <w:b/>
-          <w:bCs/>
-        </w:rPr>
-        <w:t xml:space="preserve">0.981</w:t>
-      </w:r>
-      <w:r>
-        <w:t xml:space="preserve"> </w:t>
-      </w:r>
-      <w:r>
-        <w:t xml:space="preserve">for Priority; top-10 overlap</w:t>
-      </w:r>
-      <w:r>
-        <w:t xml:space="preserve"> </w:t>
-      </w:r>
-      <w:r>
-        <w:rPr>
-          <w:b/>
-          <w:bCs/>
-        </w:rPr>
-        <w:t xml:space="preserve">10/10</w:t>
-      </w:r>
-      <w:r>
-        <w:t xml:space="preserve">;</w:t>
-      </w:r>
-      <w:r>
-        <w:t xml:space="preserve"> </w:t>
-      </w:r>
-      <w:r>
-        <w:rPr>
-          <w:i/>
-          <w:iCs/>
-        </w:rPr>
-        <w:t xml:space="preserve">C. atromarginatus</w:t>
-      </w:r>
-      <w:r>
-        <w:t xml:space="preserve"> </w:t>
-      </w:r>
-      <w:r>
-        <w:t xml:space="preserve">unchanged at rank 9),</w:t>
-      </w:r>
-      <w:r>
-        <w:t xml:space="preserve"> </w:t>
-      </w:r>
-      <w:r>
-        <w:t xml:space="preserve">while scores redistribute sensibly toward species whose relatives have only single-assembly</w:t>
-      </w:r>
-      <w:r>
-        <w:t xml:space="preserve"> </w:t>
-      </w:r>
-      <w:r>
-        <w:t xml:space="preserve">coverage (e.g.,</w:t>
-      </w:r>
-      <w:r>
-        <w:t xml:space="preserve"> </w:t>
-      </w:r>
-      <w:r>
-        <w:rPr>
-          <w:i/>
-          <w:iCs/>
-        </w:rPr>
-        <w:t xml:space="preserve">Carcharhinus falciformis</w:t>
-      </w:r>
-      <w:r>
-        <w:t xml:space="preserve"> </w:t>
-      </w:r>
-      <w:r>
-        <w:t xml:space="preserve">rises from rank 738 to 389). This converts the</w:t>
-      </w:r>
-      <w:r>
-        <w:t xml:space="preserve"> </w:t>
-      </w:r>
-      <w:r>
-        <w:t xml:space="preserve">point from</w:t>
-      </w:r>
-      <w:r>
-        <w:t xml:space="preserve"> </w:t>
-      </w:r>
-      <w:r>
-        <w:t xml:space="preserve">“S can be continuous”</w:t>
-      </w:r>
-      <w:r>
-        <w:t xml:space="preserve"> </w:t>
-      </w:r>
-      <w:r>
-        <w:t xml:space="preserve">to</w:t>
-      </w:r>
-      <w:r>
-        <w:t xml:space="preserve"> </w:t>
-      </w:r>
-      <w:r>
-        <w:t xml:space="preserve">“it behaves correctly when continuous.”</w:t>
-      </w:r>
-      <w:r>
-        <w:t xml:space="preserve"> </w:t>
-      </w:r>
-      <w:r>
-        <w:t xml:space="preserve">(Supplementary</w:t>
-      </w:r>
-      <w:r>
-        <w:t xml:space="preserve"> </w:t>
-      </w:r>
-      <w:r>
-        <w:t xml:space="preserve">Fig. S5.)</w:t>
+        <w:t xml:space="preserve">The binary case-study coding is retained and justified explicitly; the worked constructions</w:t>
+      </w:r>
+      <w:r>
+        <w:t xml:space="preserve"> </w:t>
+      </w:r>
+      <w:r>
+        <w:t xml:space="preserve">above show how a continuous S is specified, so we did not add a separate continuous-S run.</w:t>
       </w:r>
     </w:p>
     <w:bookmarkEnd w:id="10"/>
@@ -1095,7 +954,7 @@
         <w:t xml:space="preserve"> </w:t>
       </w:r>
       <w:r>
-        <w:t xml:space="preserve">auto-selected choice rather than an artifact of one λ (Supplementary Fig. S2).</w:t>
+        <w:t xml:space="preserve">auto-selected choice rather than an artifact of one λ (Supplementary Fig. S1).</w:t>
       </w:r>
     </w:p>
     <w:p>
@@ -1493,7 +1352,7 @@
         <w:t xml:space="preserve"> </w:t>
       </w:r>
       <w:r>
-        <w:t xml:space="preserve">tunable horizon (Supplementary Fig. S7). We additionally note a decisive computational argument for</w:t>
+        <w:t xml:space="preserve">tunable horizon (Supplementary Fig. S5). We additionally note a decisive computational argument for</w:t>
       </w:r>
       <w:r>
         <w:t xml:space="preserve"> </w:t>
@@ -1821,7 +1680,7 @@
         <w:t xml:space="preserve"> </w:t>
       </w:r>
       <w:r>
-        <w:t xml:space="preserve">are sequenced (Supplementary Fig. S4; divergence table in the supplement).</w:t>
+        <w:t xml:space="preserve">are sequenced (Supplementary Fig. S3; divergence table in the supplement).</w:t>
       </w:r>
     </w:p>
     <w:bookmarkEnd w:id="12"/>
@@ -2233,7 +2092,7 @@
         <w:t xml:space="preserve"> </w:t>
       </w:r>
       <w:r>
-        <w:t xml:space="preserve">we had flagged as future work (Supplementary Fig. S6 now contrasts the two regimes).</w:t>
+        <w:t xml:space="preserve">we had flagged as future work (Supplementary Fig. S4 now contrasts the two regimes).</w:t>
       </w:r>
     </w:p>
     <w:p>
@@ -2369,7 +2228,7 @@
         <w:t xml:space="preserve"> </w:t>
       </w:r>
       <w:r>
-        <w:t xml:space="preserve">scale (Supplementary Fig. S6). For those dense kernels, a truncated/sparse approximation remains a</w:t>
+        <w:t xml:space="preserve">scale (Supplementary Fig. S4). For those dense kernels, a truncated/sparse approximation remains a</w:t>
       </w:r>
       <w:r>
         <w:t xml:space="preserve"> </w:t>
@@ -2919,19 +2778,13 @@
         <w:t xml:space="preserve"> </w:t>
       </w:r>
       <w:r>
-        <w:t xml:space="preserve">worked continuous constructions in the Methods and added the supplementary continuous-S analysis</w:t>
-      </w:r>
-      <w:r>
-        <w:t xml:space="preserve"> </w:t>
-      </w:r>
-      <w:r>
-        <w:t xml:space="preserve">(ρ = 0.98 vs binary; top target unchanged). The binary coding is retained for the main case study</w:t>
-      </w:r>
-      <w:r>
-        <w:t xml:space="preserve"> </w:t>
-      </w:r>
-      <w:r>
-        <w:t xml:space="preserve">with its rationale stated.</w:t>
+        <w:t xml:space="preserve">worked continuous constructions in the Methods (data-type breadth and quality gradients). The binary</w:t>
+      </w:r>
+      <w:r>
+        <w:t xml:space="preserve"> </w:t>
+      </w:r>
+      <w:r>
+        <w:t xml:space="preserve">coding is retained for the main case study with its rationale stated.</w:t>
       </w:r>
     </w:p>
     <w:bookmarkEnd w:id="18"/>

</xml_diff>